<commit_message>
Field Notes: add posts 21-26 to match the private blog
Co-Authored-By: Claude Sonnet 5.5 <noreply@anthropic.com>
Claude-Session: https://claude.ai/code/session_01TDEecx11fZJG7Z9gmzjxyw
</commit_message>
<xml_diff>
--- a/field-note-21.docx
+++ b/field-note-21.docx
@@ -2,13 +2,13 @@
 <file path=word/document.xml><?xml version="1.0" encoding="utf-8"?>
 <w:document xmlns:w="http://schemas.openxmlformats.org/wordprocessingml/2006/main" xmlns:m="http://schemas.openxmlformats.org/officeDocument/2006/math" xmlns:r="http://schemas.openxmlformats.org/officeDocument/2006/relationships" xmlns:o="urn:schemas-microsoft-com:office:office" xmlns:v="urn:schemas-microsoft-com:vml" xmlns:w10="urn:schemas-microsoft-com:office:word" xmlns:a="http://schemas.openxmlformats.org/drawingml/2006/main" xmlns:pic="http://schemas.openxmlformats.org/drawingml/2006/picture" xmlns:wp="http://schemas.openxmlformats.org/drawingml/2006/wordprocessingDrawing">
   <w:body>
-    <w:bookmarkStart w:id="30" w:name="the-thinned-prime"/>
+    <w:bookmarkStart w:id="29" w:name="the-laboratory-cannot-read-this-patient"/>
     <w:p>
       <w:pPr>
         <w:pStyle w:val="Heading1"/>
       </w:pPr>
       <w:r>
-        <w:t xml:space="preserve">The Thinned Prime</w:t>
+        <w:t xml:space="preserve">The Laboratory Cannot Read This Patient</w:t>
       </w:r>
     </w:p>
     <w:p>
@@ -20,16 +20,16 @@
           <w:iCs/>
           <w:i/>
         </w:rPr>
-        <w:t xml:space="preserve">Every heart operation on a pump begins by diluting the patient’s own oxygen carrier on purpose, and the history of that decision is a quiet argument about how little hemoglobin a body can be trusted with</w:t>
-      </w:r>
-    </w:p>
-    <w:bookmarkStart w:id="20" w:name="the-bargain-made-at-the-circuit-door"/>
+        <w:t xml:space="preserve">A bovine oxygen carrier turns plasma the color of port wine, and every instrument built to distrust that color keeps right on distrusting it, which is a quieter hazard than any toxicity table admits</w:t>
+      </w:r>
+    </w:p>
+    <w:bookmarkStart w:id="20" w:name="the-tube-that-looks-like-an-accusation"/>
     <w:p>
       <w:pPr>
         <w:pStyle w:val="Heading2"/>
       </w:pPr>
       <w:r>
-        <w:t xml:space="preserve">The bargain made at the circuit door</w:t>
+        <w:t xml:space="preserve">The tube that looks like an accusation</w:t>
       </w:r>
     </w:p>
     <w:p>
@@ -37,33 +37,25 @@
         <w:pStyle w:val="FirstParagraph"/>
       </w:pPr>
       <w:r>
-        <w:t xml:space="preserve">Before a surgeon on a bypass pump touches the heart, someone has filled the machine with fluid. The tubing, the oxygenator, the reservoir and the pump head together hold a volume that is not trivial, and that volume has to be something. For the first years of the technique it was donor blood, a great deal of it, and the recipient of an operation on a few grams of malformed muscle might receive the blood of a dozen strangers before the chest was closed. Then a different idea took hold, almost sideways, and the machine began to be filled with clear fluid instead. The patient’s blood, on contact with the circuit, mixed into that fluid and became thinner. The hematocrit fell sharply, and the surgeons went on operating.</w:t>
-      </w:r>
-    </w:p>
-    <w:p>
-      <w:pPr>
-        <w:pStyle w:val="BodyText"/>
-      </w:pPr>
-      <w:r>
-        <w:t xml:space="preserve">That is the arrangement most cardiac patients still enter. It is rarely described to them, and for good reason: it sounds alarming, and mostly it works. Yet it carries a premise that deserves to be looked at squarely, because it is the only routine, planned, every-day case in modern medicine in which clinicians deliberately reduce the oxygen-carrying capacity of a living person and then compensate by other means. The compensation is considerable. The body is often cooled, which lowers its demand, the pump flow is set by the team, and the anesthetist watches the numbers that stand in for oxygen delivery. The bargain is that less carrier, moving faster in a quieter body, will do.</w:t>
-      </w:r>
-    </w:p>
-    <w:p>
-      <w:pPr>
-        <w:pStyle w:val="BodyText"/>
-      </w:pPr>
-      <w:r>
-        <w:t xml:space="preserve">This essay is about that bargain, not about the pump as an engineering marvel. The engineering story has been told many times. The less told story is the one inside the fluid: who first decided that the prime need not be blood, what that decision cost and saved, and why anyone who thinks about a hemoglobin-based oxygen carrier should care that surgeons have spent seventy years learning how far a patient’s own hemoglobin can be diluted before something fails.</w:t>
+        <w:t xml:space="preserve">Picture a composite scene rather than a particular hospital. A patient who has lost most of a normal blood volume has been given a Biologic Hemoglobin Oxygen Carrier, a BHOC, because red cells were refused, unavailable or incompatible. Forty minutes later a phlebotomist draws a sample, spins it, and finds that the straw-yellow plasma that every technician has seen ten thousand times has turned a deep burgundy, a shade somewhere between cranberry juice and a cheap merlot. Nothing about this is a mistake. The carrier is hemoglobin, hemoglobin is red, and the carrier now travels dissolved in the plasma instead of folded inside a cell. But the laboratory does not know that, and the laboratory has been trained, by its instruments, its quality manuals and a century of accumulated habit, to read that color as a verdict against the person who drew the blood.</w:t>
+      </w:r>
+    </w:p>
+    <w:p>
+      <w:pPr>
+        <w:pStyle w:val="BodyText"/>
+      </w:pPr>
+      <w:r>
+        <w:t xml:space="preserve">This essay is about that collision. Most writing on oxygen carriers asks whether the molecule works in the patient, whether it injures the vessel wall, whether it can be made at scale. Those questions deserve every page they receive. But a molecule that works in the body can still fail in the hospital if the hospital cannot see the patient through it, and the laboratory is the hospital’s principal pair of eyes. I think the problem is under-discussed because it is unglamorous: it lives in middleware rules, wavelength tables and the small print of analyzer inserts, none of which appear in the press releases and few of which appear in the review articles.</w:t>
       </w:r>
     </w:p>
     <w:bookmarkEnd w:id="20"/>
-    <w:bookmarkStart w:id="21" w:name="X78c50a1351ad62db861e150f75f205b8c2e83ca"/>
+    <w:bookmarkStart w:id="21" w:name="X6c3477d5e62508d40a3ed664d5d46bd3334578b"/>
     <w:p>
       <w:pPr>
         <w:pStyle w:val="Heading2"/>
       </w:pPr>
       <w:r>
-        <w:t xml:space="preserve">What the first machines asked of the blood</w:t>
+        <w:t xml:space="preserve">Why a laboratory is built to distrust free hemoglobin</w:t>
       </w:r>
     </w:p>
     <w:p>
@@ -71,41 +63,33 @@
         <w:pStyle w:val="FirstParagraph"/>
       </w:pPr>
       <w:r>
-        <w:t xml:space="preserve">The pump-oxygenator’s early history is a record of attrition. John Gibbon had spent years chasing the idea after the seventeen-hour vigil in 1931 beside a woman dying of a pulmonary embolism. His success on May 6, 1953, with an eighteen-year-old named Cecelia Bavolek, is credited as the first successful open cardiac repair with a mechanical heart-lung machine. The accounts I found disagree on how long she was on the machine, with one saying twenty-six minutes of full support and another forty-five minutes on the device, so I will not choose between them. What the accounts agree on is the sobering part: she was the only survivor among the handful of patients he attempted, reported as four to six, and Gibbon stopped operating soon afterward.</w:t>
-      </w:r>
-    </w:p>
-    <w:p>
-      <w:pPr>
-        <w:pStyle w:val="BodyText"/>
-      </w:pPr>
-      <w:r>
-        <w:t xml:space="preserve">Two other lines of work grew up in the same few years. In Minnesota, C. Walton Lillehei took a different path and used a living parent as the oxygenator. Blood passed between a child and an adult, and the adult’s lungs did the work. The first success came on March 26, 1954. One account puts the number of such operations at forty-five, with twenty-eight patients surviving, and observes grimly that the technique risked two lives for every operation. At the Mayo Clinic, John Kirklin’s group had approval from its hospital board for eight operations on the understanding that the first seven patients might all die. They began in March 1955, and about half of the cases in that first series survived.</w:t>
-      </w:r>
-    </w:p>
-    <w:p>
-      <w:pPr>
-        <w:pStyle w:val="BodyText"/>
-      </w:pPr>
-      <w:r>
-        <w:t xml:space="preserve">Richard DeWall’s disposable oxygenator, built in 1955 for under a thousand dollars according to the history I read, changed the economics. Within two years, one source says, 350 open-heart operations had been done at the University of Minnesota, and the design stayed in use into the 1970s. Cheap and simple as it was, it created a new appetite. The device had to be filled before every case, and filling it with fresh, compatible blood meant that every operation demanded a collection drive. Every operation became, in part, a blood collection exercise.</w:t>
-      </w:r>
-    </w:p>
-    <w:p>
-      <w:pPr>
-        <w:pStyle w:val="BodyText"/>
-      </w:pPr>
-      <w:r>
-        <w:t xml:space="preserve">I want to dwell on that detail because it is the pressure that made the next move thinkable. The prime was a supply problem before it was a physiological one. Anything that reduced the volume of donor blood needed would make open-heart surgery cheaper, faster and available to more places, and nobody was asking at that stage what dilution did to the patient. They were asking whether the patient would survive the night.</w:t>
+        <w:t xml:space="preserve">To understand the collision you have to understand what the red color means to a chemistry analyzer. In ordinary life, hemoglobin in plasma almost always means that red cells broke open somewhere they should not have, usually in the tube, through a needle too narrow, a draw too forceful or a delay before spinning. The laboratory treats that as contamination, because breaking a red cell releases its contents, present at far higher concentrations inside the cell than outside. A veterinary pathology teaching site I consulted lists the standard consequences: falsely raised potassium, AST, LDH and magnesium, plus spectral effects on any test that reads light near the absorbance range of hemoglobin.</w:t>
+      </w:r>
+    </w:p>
+    <w:p>
+      <w:pPr>
+        <w:pStyle w:val="BodyText"/>
+      </w:pPr>
+      <w:r>
+        <w:t xml:space="preserve">Modern analyzers measure this rather than eyeballing it. A laboratory-medicine primer on serum indices describes instruments reading the sample at several wavelengths, with hemoglobin absorbing light between roughly 340 and 440 nanometers and again between roughly 540 and 580, and computing a hemolysis index from wavelength pairs, 600 and 570 nanometers in the example of one widely used analyzer. Manufacturers publish limits for each assay, and laboratories write middleware rules, small programs between the analyzer and the hospital record, that stop results from being released automatically when the index exceeds a limit. In the ordinary case the lab then asks for a fresh draw, hunts for an unspoiled specimen from the same collection time, or releases the number with a comment.</w:t>
+      </w:r>
+    </w:p>
+    <w:p>
+      <w:pPr>
+        <w:pStyle w:val="BodyText"/>
+      </w:pPr>
+      <w:r>
+        <w:t xml:space="preserve">Now put a BHOC into this machinery. The same primer treats hemoglobin as a spectral and chemical nuisance. A carrier delivers hemoglobin on purpose, in concentrations that are not accidents of technique but a dose chosen by a prescriber. The analyzer sees a hemolysis index that would embarrass any phlebotomist, applies the rule it was told to apply, and withholds, flags or corrupts the result. A clinical laboratory page from a large academic center says the problem in one sentence that I find unusually clear: the presence of the carrier causes red-colored plasma that should not be confused with hemolysis of the red blood cells, and, strikingly, hemolysis cannot be detected in the presence of the carrier. I will return to that second clause, because I think it is the most consequential line in the entire literature on this subject.</w:t>
       </w:r>
     </w:p>
     <w:bookmarkEnd w:id="21"/>
-    <w:bookmarkStart w:id="22" w:name="sugar-water"/>
+    <w:bookmarkStart w:id="22" w:name="what-the-measurements-show"/>
     <w:p>
       <w:pPr>
         <w:pStyle w:val="Heading2"/>
       </w:pPr>
       <w:r>
-        <w:t xml:space="preserve">Sugar water</w:t>
+        <w:t xml:space="preserve">What the measurements show</w:t>
       </w:r>
     </w:p>
     <w:p>
@@ -113,49 +97,49 @@
         <w:pStyle w:val="FirstParagraph"/>
       </w:pPr>
       <w:r>
-        <w:t xml:space="preserve">The turn toward clear primes is usually credited to a handful of surgeons working around 1960, and the name that recurs for the idea is Nazih Zuhdi, who in Oklahoma described what he called total intentional hemodilution. A profile of him in a regional magazine relates the story as a question: what, he wondered, would happen if sugar water were used. In the account I read, the first human recipient was a seven-year-old boy named Terry Gene Nix, operated on in February 1960, who needed about a pint and a half of replacement blood rather than gallons. The same account says he died three years later of an unrelated illness. I could not find the operative details in a primary source, and the profile does not name the hospital, so I treat this as the origin legend rather than the verified record. But the legend has the right shape: a single bold substitution, a child, an outcome that did not collapse.</w:t>
-      </w:r>
-    </w:p>
-    <w:p>
-      <w:pPr>
-        <w:pStyle w:val="BodyText"/>
-      </w:pPr>
-      <w:r>
-        <w:t xml:space="preserve">The hard evidence appears a few years later. In 1965, a group led by Sariel Ablaza published in the</w:t>
-      </w:r>
-      <w:r>
-        <w:t xml:space="preserve"> </w:t>
-      </w:r>
-      <w:r>
-        <w:rPr>
-          <w:iCs/>
-          <w:i/>
-        </w:rPr>
-        <w:t xml:space="preserve">Archives of Surgery</w:t>
-      </w:r>
-      <w:r>
-        <w:t xml:space="preserve"> </w:t>
-      </w:r>
-      <w:r>
-        <w:t xml:space="preserve">a report on five hundred consecutive open-heart cases done with intentional hemodilution. The abstract frames the matter the way I have been describing it, saying that obtaining blood for priming the circuit had caused substantial difficulty in open-heart surgery and that hemodilution had developed out of earlier work. I could read only the opening of that paper, so I cannot report its outcomes, and I would rather say so than guess.</w:t>
-      </w:r>
-    </w:p>
-    <w:p>
-      <w:pPr>
-        <w:pStyle w:val="BodyText"/>
-      </w:pPr>
-      <w:r>
-        <w:t xml:space="preserve">What is important about this period is not any one number. It is that a cultural permission had been granted. Once surgeons had seen patients survive a hematocrit that would have prompted an urgent transfusion on a ward, the threshold moved, and it moved for the whole specialty. The prime changed from a blood product into a solution, usually balanced salts with some added colloid or sugar depending on the era and the institution, and the patient’s own red cells were the part that got watered down.</w:t>
+        <w:t xml:space="preserve">The detail matters here, because the lazy summary, that these carriers wreck lab tests, is wrong in an instructive way. The truth is patchier and therefore harder to manage.</w:t>
+      </w:r>
+    </w:p>
+    <w:p>
+      <w:pPr>
+        <w:pStyle w:val="BodyText"/>
+      </w:pPr>
+      <w:r>
+        <w:t xml:space="preserve">Consider the largest set of numbers I could verify. A study from 2018 tested the bovine carrier sold as Hemopure on four common chemistry platforms, covering 26 analytes across 104 combinations of assay, method and platform. The authors graded each result against the allowable total error for that test. In 44 of the 104 combinations, about 42 percent, the bias stayed within half the allowable error, which is the zone you can live with. In 23 combinations, about 22 percent, the carrier pushed the result significantly downward. In 26 combinations, 25 percent, it pushed the result significantly upward. In 11 combinations, about 11 percent, the analysis simply failed. Put differently, fewer than half of the tests you might order were trustworthy, and more than half either lied in one direction or the other or refused to answer. The authors attributed this to the extracellular hemoglobin mimicking severe hemolysis.</w:t>
+      </w:r>
+    </w:p>
+    <w:p>
+      <w:pPr>
+        <w:pStyle w:val="BodyText"/>
+      </w:pPr>
+      <w:r>
+        <w:t xml:space="preserve">An earlier study, published in 1997 in Clinical Chemistry, took a more varied approach and tested several hemoglobin-based carriers alongside a perfluorocarbon emulsion. At concentrations up to 50 grams per liter, the hemoglobin carriers caused essentially no interference with electrolytes, glucose and standard immunoassays, while they significantly affected protein, enzyme and cholesterol measurements on certain analyzers. In coagulation testing the effect depended on method, with some techniques unaffected and others disturbed at 20 grams per liter. The cardiac marker CK-MB read falsely low at only 5 grams per liter. Among drug levels, one aminoglycoside antibiotic read falsely high and the glycopeptide vancomycin read falsely low. The perfluorocarbon, diluted twenty-fold, interfered with none of the chemistry or immunoassay tests studied except amylase, ammonia and plasma iron. I take two lessons from that older paper. First, the problem is test-specific and method-specific, so a one-page warning sheet will be wrong in half its lines. Second, the problem is physical rather than moral: a carrier built on a different principle, oxygen dissolved in fluorocarbon droplets, goes mostly unseen by the instruments, because it is not a colored protein.</w:t>
+      </w:r>
+    </w:p>
+    <w:p>
+      <w:pPr>
+        <w:pStyle w:val="BodyText"/>
+      </w:pPr>
+      <w:r>
+        <w:t xml:space="preserve">Coagulation deserves a separate mention, because the workaround there is unusually clean. The academic laboratory page I consulted says that the prothrombin time and the activated partial thromboplastin time are disturbed when the instrument detects clotting optically, yet can be measured accurately with mechanical, magnetic or light-scattering techniques, and that platelet counts can also be measured accurately. A patient on a carrier can therefore be monitored for bleeding, but the laboratory must route those samples to a particular instrument, and somebody must know to do that before a surgeon asks why the clotting numbers are absurd.</w:t>
+      </w:r>
+    </w:p>
+    <w:p>
+      <w:pPr>
+        <w:pStyle w:val="BodyText"/>
+      </w:pPr>
+      <w:r>
+        <w:t xml:space="preserve">The pulse oximeter is the most reassuring case, and I include it for balance. A 1996 study of a bovine carrier compared finger-probe saturation with saturation from arterial blood gas analysis. Over 24 hours the mean difference in treated subjects was about 1.1 percent, with a standard error of 0.75, against 0.1 percent in controls, statistically significant but small, and the authors concluded that pulse oximetry stayed accurate across the normal range with plasma hemoglobin at 10 to 20 grams per liter. The laboratory page, by contrast, warns that the right-shifted dissociation curve may cause falsely high pulse readings and advises true saturation by co-oximetry. A shift of about one percentage point is small at the bedside and large in a research dataset, and the gap between what a clinician needs and what a trialist needs is part of the story.</w:t>
       </w:r>
     </w:p>
     <w:bookmarkEnd w:id="22"/>
-    <w:bookmarkStart w:id="23" w:name="the-smallest-bodies"/>
+    <w:bookmarkStart w:id="23" w:name="a-single-bed-closely-read"/>
     <w:p>
       <w:pPr>
         <w:pStyle w:val="Heading2"/>
       </w:pPr>
       <w:r>
-        <w:t xml:space="preserve">The smallest bodies</w:t>
+        <w:t xml:space="preserve">A single bed, closely read</w:t>
       </w:r>
     </w:p>
     <w:p>
@@ -163,33 +147,33 @@
         <w:pStyle w:val="FirstParagraph"/>
       </w:pPr>
       <w:r>
-        <w:t xml:space="preserve">Dilution is a matter of proportion, and proportion is cruelest in the small. A circuit has a fixed minimum volume, and an infant’s whole circulation may be little larger than that volume, so the clear fluid can rival or exceed the patient’s own blood. If the technique had a stress test, it would be the operating room for newborns and infants, where the same tubing that is a modest dilution for an adult becomes a flood.</w:t>
-      </w:r>
-    </w:p>
-    <w:p>
-      <w:pPr>
-        <w:pStyle w:val="BodyText"/>
-      </w:pPr>
-      <w:r>
-        <w:t xml:space="preserve">A retrospective review in the Texas Heart Institute Journal in March 1985, by Carmichael, Cooley, Kuykendall and Walker, gives a sense of what experienced hands achieved there. It covered seventy-three consecutive children under two years old with lesions of the heart and great vessels, all managed without donor blood. Nine died, a mortality of 12.3 percent, and only three of the nine deaths involved blood loss and anemia. Among the fifteen children who needed full cardiopulmonary bypass there were no deaths, and a bloodless prime was used in all seventy-three. The authors concluded that surgery could be done in these children with acceptable mortality.</w:t>
-      </w:r>
-    </w:p>
-    <w:p>
-      <w:pPr>
-        <w:pStyle w:val="BodyText"/>
-      </w:pPr>
-      <w:r>
-        <w:t xml:space="preserve">Read carefully, the paper cuts two ways. It shows that very small circulations can survive a blood-free prime in a center with unusual experience. It also records that three of nine deaths involved blood loss and anemia, so for a minority the margin was real and was crossed. The paper does not report the hemoglobin levels tolerated, so it cannot say where the cliff edge sits, and it describes the survivors of a selection process as much as a technique. The broader lesson is that the average patient has more reserve than the average protocol assumes, and that no individual can be assumed average.</w:t>
+        <w:t xml:space="preserve">Numbers across assays are abstractions. A case report gives the problem a pulse. The report, from a journal of blood research and disorders, describes a patient who was a Jehovah’s Witness with life-threatening anemia and received the bovine carrier. I want to be careful here: it is one patient, reported by the team that treated her or him, and nothing about a single case generalizes. What it does show is how the laboratory problem looks from the bedside.</w:t>
+      </w:r>
+    </w:p>
+    <w:p>
+      <w:pPr>
+        <w:pStyle w:val="BodyText"/>
+      </w:pPr>
+      <w:r>
+        <w:t xml:space="preserve">The authors write that the product is purple and causes errors in laboratory values, often being read as hemolyzed when it is not. They explain that the oxygen-carrying capacity has to be followed as total free hemoglobin, and that each unit raised free hemoglobin by about 0.63 grams per deciliter, although quantifying the response was difficult. Their pre-operative hemoglobin was 5 grams per deciliter, 5.7 by the sixth post-operative day and 9 by the sixteenth. Those figures describe a number on a report, not oxygen delivery. What they leaned on instead was the patient’s behavior: they say they saw an effect immediately and weaned vasopressors within a day of surgery. The principal laboratory complication they followed was methemoglobin, hemoglobin with its iron oxidized and unable to carry oxygen. It was 4.6 percent on the first post-operative day, peaked at 8.6 percent early on the second, and returned to normal by the seventh. They gave vitamin C, 500 milligrams every twelve hours, and kept arterial oxygen pressures supratherapeutic at 300 to 400 millimeters of mercury.</w:t>
+      </w:r>
+    </w:p>
+    <w:p>
+      <w:pPr>
+        <w:pStyle w:val="BodyText"/>
+      </w:pPr>
+      <w:r>
+        <w:t xml:space="preserve">Notice what is happening in that account. The team could not trust the ordinary hemoglobin number to mean what it normally means, so they substituted a different measurement and leaned on bedside physiology. A general principle, not something the report states, explains why. A routine hemoglobin measurement breaks open every red cell in the sample and reads all the hemoglobin that comes out, so it cannot distinguish hemoglobin that was inside cells from hemoglobin already floating free. A patient receiving a carrier therefore has a total figure that blends two very different oxygen-carrying systems, one confined to cells, the other dissolved and disappearing on a clock of its own. A 2023 study evaluated the bovine carrier on four hematology analyzers, but the journal page declined my attempts to read it, so I cannot report what it found, and I would rather leave that gap visible than fill it with a guess.</w:t>
       </w:r>
     </w:p>
     <w:bookmarkEnd w:id="23"/>
-    <w:bookmarkStart w:id="24" w:name="where-the-reserve-ends"/>
+    <w:bookmarkStart w:id="24" w:name="the-canary-that-goes-silent"/>
     <w:p>
       <w:pPr>
         <w:pStyle w:val="Heading2"/>
       </w:pPr>
       <w:r>
-        <w:t xml:space="preserve">Where the reserve ends</w:t>
+        <w:t xml:space="preserve">The canary that goes silent</w:t>
       </w:r>
     </w:p>
     <w:p>
@@ -197,49 +181,41 @@
         <w:pStyle w:val="FirstParagraph"/>
       </w:pPr>
       <w:r>
-        <w:t xml:space="preserve">If you go looking for the point at which dilution stops being tolerable, you find that the answer depends heavily on which organ you ask. The brain, the heart and the kidney have different tolerances and, in a pump, different exposures. The kidney is the instructive case, because it is an organ that works at the edge of its oxygen supply even in health. Its medulla sits in a region of low oxygen tension by design, and it has very little to spare.</w:t>
-      </w:r>
-    </w:p>
-    <w:p>
-      <w:pPr>
-        <w:pStyle w:val="BodyText"/>
-      </w:pPr>
-      <w:r>
-        <w:t xml:space="preserve">A frequently cited study by Swaminathan and colleagues and published in the</w:t>
-      </w:r>
-      <w:r>
-        <w:t xml:space="preserve"> </w:t>
-      </w:r>
-      <w:r>
-        <w:rPr>
-          <w:iCs/>
-          <w:i/>
-        </w:rPr>
-        <w:t xml:space="preserve">Annals of Thoracic Surgery</w:t>
-      </w:r>
-      <w:r>
-        <w:t xml:space="preserve"> </w:t>
-      </w:r>
-      <w:r>
-        <w:t xml:space="preserve">in 2003, followed 1,404 patients who had primary elective coronary bypass surgery. They found that the lowest hematocrit reached during bypass was associated with the change in serum creatinine afterward, and that the relationship interacted with body weight, meaning the same dilution did different things to different-sized patients. Their own conclusion was that current guidelines accepting extreme hemodilution may contribute to injury to the kidney and other organs after surgery. I take that as a cautious signal, not a proof. It is an observational study; patients who reach a low hematocrit are not randomly chosen, they tend to be smaller, or to have larger circuits relative to their blood volume, or to have been operated on by teams with particular habits. Correlation of that kind is exactly what an honest reader should handle with tongs.</w:t>
-      </w:r>
-    </w:p>
-    <w:p>
-      <w:pPr>
-        <w:pStyle w:val="BodyText"/>
-      </w:pPr>
-      <w:r>
-        <w:t xml:space="preserve">The profession’s practical answer has been to stop treating hematocrit as the number to watch. If the problem is delivery of oxygen to tissue, then the relevant quantity is the product of flow and the oxygen content of the blood, and flow can be raised when content is low. This is the logic behind what perfusionists call goal-directed perfusion, in which the pump flow is adjusted continuously to keep an indexed oxygen delivery above a chosen floor. A multicenter randomized trial of that approach was registered under the name GIFT, but when I tried to open the registry record the page returned only site boilerplate, so I cannot tell you its size, its target or its status, and I will not repeat numbers I have only half remembered. What I can say is that the existence of such trials marks a change in vocabulary: the field no longer asks how little blood a patient can have, but how much oxygen the patient is getting per minute, and by what route.</w:t>
+        <w:t xml:space="preserve">Return now to the sentence I flagged: hemolysis cannot be detected in the presence of the carrier.</w:t>
+      </w:r>
+    </w:p>
+    <w:p>
+      <w:pPr>
+        <w:pStyle w:val="BodyText"/>
+      </w:pPr>
+      <w:r>
+        <w:t xml:space="preserve">In transfusion medicine, free hemoglobin in the plasma is one of the oldest alarms in the building. When a patient receives red cells of the wrong type, the recipient’s antibodies destroy the donor cells, hemoglobin spills into plasma, and the plasma and urine change color. A technician who sees pink plasma after a transfusion reaction is trained to stop and think. That alarm exists because nature made red cells fragile in a specific way, and because plasma is supposed to be nearly colorless. A BHOC removes the second condition. If the plasma is already burgundy by design, the alarm has no sensitivity left. A real hemolytic event, whether from a mismatched red cell unit given in the same resuscitation, from a failing circulation, or from something the carrier itself did, would be hidden in the very place where it normally announces itself.</w:t>
+      </w:r>
+    </w:p>
+    <w:p>
+      <w:pPr>
+        <w:pStyle w:val="BodyText"/>
+      </w:pPr>
+      <w:r>
+        <w:t xml:space="preserve">That is my reasoning rather than a documented incident. I did not find a case in the sources I read where a missed hemolytic event was traced to this mask, and I would be inventing a story if I suggested otherwise. But the structure is clear enough to name as a design risk. The settings where a carrier makes sense, massive hemorrhage, refusal of transfusion, remote injury, are the same settings where several fluids and drugs arrive at once, and the laboratory tools that would help sort out which of them did what are the ones the carrier has degraded.</w:t>
+      </w:r>
+    </w:p>
+    <w:p>
+      <w:pPr>
+        <w:pStyle w:val="BodyText"/>
+      </w:pPr>
+      <w:r>
+        <w:t xml:space="preserve">I want to push a second consequence, because I rarely see it discussed. A red tube is also a break in blinding. If a randomized trial compares a carrier to a standard fluid, every phlebotomist, technician and nurse can see which arm a patient is in by looking at a centrifuged specimen. Allocation concealment may survive at the pharmacy door and fail at the sample rack. The concern is observer bias, sharpest for judgment-dependent outcomes such as whether to transfuse a rescue unit or repeat a test. Independent adjudicators who see only coded data, and transfusion triggers fixed in advance, are the known defenses, and the physical color of the specimen is a reason to build them on purpose.</w:t>
       </w:r>
     </w:p>
     <w:bookmarkEnd w:id="24"/>
-    <w:bookmarkStart w:id="25" w:name="the-other-way-to-save-the-blood"/>
+    <w:bookmarkStart w:id="25" w:name="workarounds-that-already-exist"/>
     <w:p>
       <w:pPr>
         <w:pStyle w:val="Heading2"/>
       </w:pPr>
       <w:r>
-        <w:t xml:space="preserve">The other way to save the blood</w:t>
+        <w:t xml:space="preserve">Workarounds that already exist</w:t>
       </w:r>
     </w:p>
     <w:p>
@@ -247,49 +223,33 @@
         <w:pStyle w:val="FirstParagraph"/>
       </w:pPr>
       <w:r>
-        <w:t xml:space="preserve">The most elegant modern trick on the pump runs in the opposite direction from dilution. Instead of accepting a thinned patient, the team tries to shrink the prime so that less thinning happens. In retrograde autologous priming, the clear fluid in the arterial and venous lines is displaced by the patient’s own blood just before the machine takes over, so that the fluid is pushed out of the circuit rather than into the patient.</w:t>
-      </w:r>
-    </w:p>
-    <w:p>
-      <w:pPr>
-        <w:pStyle w:val="BodyText"/>
-      </w:pPr>
-      <w:r>
-        <w:t xml:space="preserve">A randomized trial in the</w:t>
-      </w:r>
-      <w:r>
-        <w:t xml:space="preserve"> </w:t>
-      </w:r>
-      <w:r>
-        <w:rPr>
-          <w:iCs/>
-          <w:i/>
-        </w:rPr>
-        <w:t xml:space="preserve">European Journal of Anaesthesiology</w:t>
-      </w:r>
-      <w:r>
-        <w:t xml:space="preserve"> </w:t>
-      </w:r>
-      <w:r>
-        <w:t xml:space="preserve">in 2009 tested this in small adults, those with a body surface area under 1.5 square meters, undergoing first-time, nonemergency cardiac surgery. The 120 patients were randomized to standard priming or the retrograde technique. The mean volume of prime replaced with the patient’s own blood was about 615 milliliters. Red cell transfusion while on the pump was needed in 83.3 percent of the standard group and 26.7 percent of the retrograde group. Transfusion over the whole hospital stay was 90 percent against 50 percent, though the abstract I read did not label each figure explicitly and I am inferring that the retrograde group had the lower rate. The drop in colloid osmotic pressure ten minutes after the aortic clamp was smaller in the retrograde group. Lung, kidney and liver outcomes, and the lengths of stay in intensive care and hospital, did not differ between the groups.</w:t>
-      </w:r>
-    </w:p>
-    <w:p>
-      <w:pPr>
-        <w:pStyle w:val="BodyText"/>
-      </w:pPr>
-      <w:r>
-        <w:t xml:space="preserve">That last result is worth holding up to the light: the technique cut transfusions sharply and left the softer endpoints unchanged, which may mean dilution in this range is not harmful enough to show in a trial of that size, or that the trial was powered for transfusion and not for organ injury. Both readings fit the data.</w:t>
+        <w:t xml:space="preserve">The encouraging news is that laboratory medicine has solved harder interference problems than this, and the tools exist. They are scattered, and they are rarely collected in one place for the people who need them.</w:t>
+      </w:r>
+    </w:p>
+    <w:p>
+      <w:pPr>
+        <w:pStyle w:val="BodyText"/>
+      </w:pPr>
+      <w:r>
+        <w:t xml:space="preserve">For clotting, the mechanical, magnetic and light-scattering methods avoid the optical trap. For oxygen saturation, co-oximetry, which reads many wavelengths and measures several hemoglobin species, gives a truer answer than a two-wavelength finger probe, although a literature exists showing that hemoglobin-based substitutes can disturb co-oximetry too, so I would not treat any single instrument as final authority. The same method tracks methemoglobin, as the case report shows. For total hemoglobin, plasma hemoglobin can be measured separately, revealing how much capacity sits in each compartment. For the chemistry panel, the 2018 numbers imply a pragmatic rule: assume nothing, and validate each test on the site’s own instruments with spiked samples before anyone trusts it.</w:t>
+      </w:r>
+    </w:p>
+    <w:p>
+      <w:pPr>
+        <w:pStyle w:val="BodyText"/>
+      </w:pPr>
+      <w:r>
+        <w:t xml:space="preserve">These workarounds all presume that a laboratory knows a patient has received a carrier, and in the settings that matter most that is not guaranteed. A patient moved from a roadside to a regional trauma center to a referral hospital may pass through three laboratories, and the news that burgundy plasma is intentional lives, at best, in a handoff note. Middleware that auto-rejects hemolyzed samples can do so without a human looking, and the requesting physician may see only the word hemolyzed. The system fails quietly, which is the worst way to fail.</w:t>
       </w:r>
     </w:p>
     <w:bookmarkEnd w:id="25"/>
-    <w:bookmarkStart w:id="26" w:name="Xdc2bc4297eebaeac160aebd5dce563875686f05"/>
+    <w:bookmarkStart w:id="26" w:name="what-a-laboratory-passport-would-contain"/>
     <w:p>
       <w:pPr>
         <w:pStyle w:val="Heading2"/>
       </w:pPr>
       <w:r>
-        <w:t xml:space="preserve">What a carrier in the prime would mean, and what it would not</w:t>
+        <w:t xml:space="preserve">What a laboratory passport would contain</w:t>
       </w:r>
     </w:p>
     <w:p>
@@ -297,33 +257,49 @@
         <w:pStyle w:val="FirstParagraph"/>
       </w:pPr>
       <w:r>
-        <w:t xml:space="preserve">Here the subject meets BHOC, the Biologic Hemoglobin Oxygen Carrier, and I want to be careful not to claim more than the evidence permits. BHOC is a research area. Nothing in this essay is a statement that a cell-free carrier improves outcomes in cardiac surgery, and I know of no result that would justify one. What I can do is point at the shape of the question the pump poses, because it is unusually clean.</w:t>
-      </w:r>
-    </w:p>
-    <w:p>
-      <w:pPr>
-        <w:pStyle w:val="BodyText"/>
-      </w:pPr>
-      <w:r>
-        <w:t xml:space="preserve">In nearly every other setting where a cell-free carrier is discussed, the clinical problem is chaotic: a hemorrhage with an unknown volume lost, a stroke with an unknown territory at risk, an accident with an unknown arrival time. The pump is the reverse. The circuit is known, its volume is known, the dilution is planned in advance, the patient is monitored with more instrumentation than in almost any other room in the hospital, and the moment of lowest oxygen content is predictable to within minutes. If a cell-free carrier were ever to be tested for a role, an operation in which the hemoglobin is lowered by design is one of the few places where the moment of need can be named before it arrives.</w:t>
-      </w:r>
-    </w:p>
-    <w:p>
-      <w:pPr>
-        <w:pStyle w:val="BodyText"/>
-      </w:pPr>
-      <w:r>
-        <w:t xml:space="preserve">That cleanliness has a catch. The competing remedies are many and good: smaller circuits, retrograde priming, cell salvage, flow targets set by delivery, and a unit of red cells as a last resort. A new agent would have to beat that field of cheap, well-understood tools in a population whose baseline outcomes are already good.</w:t>
+        <w:t xml:space="preserve">These are my own suggestions, drawn from the structure of the problem and not tested anywhere I know of. The first element would be a flag in the laboratory information system, set at the time of administration, that travels with the patient record and tells the lab to treat red plasma as expected. A middleware rule that suppresses automatic rejection for flagged patients is cheap compared with a repeat draw from a patient who has little blood to spare.</w:t>
+      </w:r>
+    </w:p>
+    <w:p>
+      <w:pPr>
+        <w:pStyle w:val="BodyText"/>
+      </w:pPr>
+      <w:r>
+        <w:t xml:space="preserve">The second would be a validated test menu, built before deployment. For each analyzer a site uses, a laboratory scientist would spike donor plasma with the carrier across the concentrations expected after a dose, run the routine tests, and record whether each can be trusted, which way it errs, and which alternative method to use. The 2018 study shows why this must be done per platform: 26 analytes and four instruments made 104 situations, and fewer than half behaved.</w:t>
+      </w:r>
+    </w:p>
+    <w:p>
+      <w:pPr>
+        <w:pStyle w:val="BodyText"/>
+      </w:pPr>
+      <w:r>
+        <w:t xml:space="preserve">The third would be a physical marker: a wristband or chart sticker saying that the patient has received a bovine oxygen carrier and that plasma color is expected, with a telephone number. It is a low-technology answer to a high-technology failure, and a laboratory worker who sees the burgundy tube will instinctively look for an explanation.</w:t>
+      </w:r>
+    </w:p>
+    <w:p>
+      <w:pPr>
+        <w:pStyle w:val="BodyText"/>
+      </w:pPr>
+      <w:r>
+        <w:t xml:space="preserve">The fourth would be a written specification of which measurements a trial will use for its endpoints, chosen before enrollment, with methods that survive the carrier. If a protocol depends on a number that the product itself distorts, the trial has built a hole into its own result.</w:t>
+      </w:r>
+    </w:p>
+    <w:p>
+      <w:pPr>
+        <w:pStyle w:val="BodyText"/>
+      </w:pPr>
+      <w:r>
+        <w:t xml:space="preserve">The fifth, and the one I consider most important, is shared learning. The papers I found are scattered across clinical chemistry, anesthesia, hematology, coagulation, veterinary pathology and case reports, and one page I consulted says that these products are no longer used, a sentence that shows how easily the knowledge could be forgotten while the products remain in development. Interference data should be a standing appendix to any serious BHOC dossier, updated as instruments change.</w:t>
       </w:r>
     </w:p>
     <w:bookmarkEnd w:id="26"/>
-    <w:bookmarkStart w:id="27" w:name="the-people-who-run-the-pump"/>
+    <w:bookmarkStart w:id="27" w:name="X46083398d2f04f2f850814b91945e2f69fc710c"/>
     <w:p>
       <w:pPr>
         <w:pStyle w:val="Heading2"/>
       </w:pPr>
       <w:r>
-        <w:t xml:space="preserve">The people who run the pump</w:t>
+        <w:t xml:space="preserve">Why I trust the problem more than the product</w:t>
       </w:r>
     </w:p>
     <w:p>
@@ -331,17 +307,25 @@
         <w:pStyle w:val="FirstParagraph"/>
       </w:pPr>
       <w:r>
-        <w:t xml:space="preserve">Nearly every decision above is made by a person who rarely appears in the narrative. The perfusionist sits at the machine for the whole operation, adjusting flow, temperature, anticoagulation and fluid balance minute by minute, and the history of hemodilution is in practice a history of their habits. A cell-free pigment in the plasma could alter optical readings that were designed around red cells, including the venous saturation on which many flow decisions depend. I flag that as a general feature of the class, without a figure, because the interference would depend on the product and the device. An honest development plan would therefore begin in the perfusion lab, with bench circuits and sensor behavior, and the perfusionists would be co-investigators in the real sense.</w:t>
+        <w:t xml:space="preserve">There is a quieter lesson as well, and here the labyrinthine detail resolves into a single point. The history of this field is usually told as a history of toxicity, with vasoconstriction and heart injury receiving most of the attention. Those are real. But a molecule can also fail by being unmeasurable. It is not a death sentence: electrolytes and glucose were essentially untouched in the older study, and workarounds exist for clotting and saturation. Nor is it a footnote: more than half the assay combinations in the best dataset I could verify were biased or failed. If nobody can reliably say whether a patient is improving, nobody can reliably say whether a treatment works, and an unmeasurable benefit is, for regulatory and clinical purposes, nearly the same as none. The laboratory is not downstream of the science. It is part of it.</w:t>
+      </w:r>
+    </w:p>
+    <w:p>
+      <w:pPr>
+        <w:pStyle w:val="BodyText"/>
+      </w:pPr>
+      <w:r>
+        <w:t xml:space="preserve">I do not know how long burgundy plasma persists after a typical dose, because that depends on dose and clearance, and I found no figure I trust enough to print. I also do not know how current analyzers behave, because most of the literature concerns instruments that were current when the studies ran, some of them decades ago. Those uncertainties are themselves a finding, since a field that wishes to be taken seriously should be able to say, in a table, how its product interacts with the instruments of every hospital that might receive it.</w:t>
       </w:r>
     </w:p>
     <w:bookmarkEnd w:id="27"/>
-    <w:bookmarkStart w:id="28" w:name="what-the-history-actually-teaches"/>
+    <w:bookmarkStart w:id="28" w:name="further-reading"/>
     <w:p>
       <w:pPr>
         <w:pStyle w:val="Heading2"/>
       </w:pPr>
       <w:r>
-        <w:t xml:space="preserve">What the history actually teaches</w:t>
+        <w:t xml:space="preserve">Further reading</w:t>
       </w:r>
     </w:p>
     <w:p>
@@ -349,53 +333,11 @@
         <w:pStyle w:val="FirstParagraph"/>
       </w:pPr>
       <w:r>
-        <w:t xml:space="preserve">Seventy years of this practice leave a few durable lessons, and none of them is the triumphant one. The first is that a tolerance, once granted, spreads beyond the context that justified it. Dilution was accepted to save donor blood and to spare small hospitals a recruitment campaign, and the same acceptance was later applied to patients for whom it was a bad idea. The observational evidence that low hematocrit tracks with kidney injury is a belated attempt to renegotiate a threshold that was set for logistical convenience.</w:t>
-      </w:r>
-    </w:p>
-    <w:p>
-      <w:pPr>
-        <w:pStyle w:val="BodyText"/>
-      </w:pPr>
-      <w:r>
-        <w:t xml:space="preserve">The second is that the extreme cases teach more than the average ones. The infants in the Texas series show what the technique can do when everything is optimized and what it costs when optimization falls short.</w:t>
-      </w:r>
-    </w:p>
-    <w:p>
-      <w:pPr>
-        <w:pStyle w:val="BodyText"/>
-      </w:pPr>
-      <w:r>
-        <w:t xml:space="preserve">The third is that the number a profession watches is a decision, not a fact. For decades it was the hematocrit, because a centrifuge produced it quickly, and the move toward delivery targets concedes that it was a proxy. Anyone proposing a new carrier will be asked which number they intend to move.</w:t>
-      </w:r>
-    </w:p>
-    <w:p>
-      <w:pPr>
-        <w:pStyle w:val="BodyText"/>
-      </w:pPr>
-      <w:r>
-        <w:t xml:space="preserve">The fourth, and the one I find most useful, is that clinicians have already accepted a premise that the oxygen-carrier field often treats as radical: that a patient’s carrier can be lowered, that the loss can be survived, and that the interesting question is the margin. The field began with a surgeon asking what would happen if sugar water were used. A reasonable successor question is what would happen if, in the carefully measured minutes when the hemoglobin is at its lowest, something else were carrying part of the load, and which of the many answers already in use it would have to outperform. I do not know the answer, and I distrust anyone who says they do. But the pump is where the question can be asked with the fewest unknowns, and that is a rarer luxury than it sounds.</w:t>
+        <w:t xml:space="preserve">For the quantitative picture, look for the 2018 study of the bovine carrier Hemopure on four clinical chemistry platforms, and the 1997 Clinical Chemistry paper on hemoglobin and perfluorocarbon carriers and common laboratory tests. For saturation, the 1996 study comparing pulse oximetry with arterial blood gas saturation after a bovine carrier, and a 2001 Anesthesia and Analgesia paper on co-oximetry interference, whose full text I could not open. For coagulation, a 2001 paper on the bovine carrier and coagulation testing, which I could not retrieve and cite only by subject. For the laboratory side, the Clinical Laboratory News primer on detecting and handling hemolysis using serum indices, and the University of California San Francisco clinical laboratory page on blood substitutes. For the bedside, the case report in the International Journal of Blood Research and Disorders. Figures here are quoted as I read them in abstracts or summaries; check the originals before relying on them.</w:t>
       </w:r>
     </w:p>
     <w:bookmarkEnd w:id="28"/>
-    <w:bookmarkStart w:id="29" w:name="further-reading"/>
-    <w:p>
-      <w:pPr>
-        <w:pStyle w:val="Heading2"/>
-      </w:pPr>
-      <w:r>
-        <w:t xml:space="preserve">Further reading</w:t>
-      </w:r>
-    </w:p>
-    <w:p>
-      <w:pPr>
-        <w:pStyle w:val="FirstParagraph"/>
-      </w:pPr>
-      <w:r>
-        <w:t xml:space="preserve">For the history, the American College of Cardiology’s article on the history of cardiopulmonary bypass and the Medical Design and Development piece on the chaotic beginnings of the heart-lung machine give accessible overviews, and the Wikipedia entry on Richard DeWall collects the dates of the disposable oxygenator. For hemodilution itself, the 1965 report by Ablaza and colleagues in the Archives of Surgery and the 1985 Texas Heart Institute Journal series on cardiac surgery in small children by Carmichael, Cooley, Kuykendall and Walker are the primary sources I drew on. For the question of how low is too low, see the 2003 Annals of Thoracic Surgery paper by Swaminathan and colleagues on lowest hematocrit and kidney injury. For the retrograde priming trial, search the European Journal of Anaesthesiology for 2009 and the title phrase about small adults. Where I could read only an abstract or an opening page, I have said so above.</w:t>
-      </w:r>
-    </w:p>
     <w:bookmarkEnd w:id="29"/>
-    <w:bookmarkEnd w:id="30"/>
     <w:sectPr/>
   </w:body>
 </w:document>

</xml_diff>

<commit_message>
Field Notes: add posts 21-26 to match the private blog (#58)
Claude-Session: https://claude.ai/code/session_01TDEecx11fZJG7Z9gmzjxyw

Co-authored-by: Claude <noreply@anthropic.com>
</commit_message>
<xml_diff>
--- a/field-note-21.docx
+++ b/field-note-21.docx
@@ -2,13 +2,13 @@
 <file path=word/document.xml><?xml version="1.0" encoding="utf-8"?>
 <w:document xmlns:w="http://schemas.openxmlformats.org/wordprocessingml/2006/main" xmlns:m="http://schemas.openxmlformats.org/officeDocument/2006/math" xmlns:r="http://schemas.openxmlformats.org/officeDocument/2006/relationships" xmlns:o="urn:schemas-microsoft-com:office:office" xmlns:v="urn:schemas-microsoft-com:vml" xmlns:w10="urn:schemas-microsoft-com:office:word" xmlns:a="http://schemas.openxmlformats.org/drawingml/2006/main" xmlns:pic="http://schemas.openxmlformats.org/drawingml/2006/picture" xmlns:wp="http://schemas.openxmlformats.org/drawingml/2006/wordprocessingDrawing">
   <w:body>
-    <w:bookmarkStart w:id="30" w:name="the-thinned-prime"/>
+    <w:bookmarkStart w:id="29" w:name="the-laboratory-cannot-read-this-patient"/>
     <w:p>
       <w:pPr>
         <w:pStyle w:val="Heading1"/>
       </w:pPr>
       <w:r>
-        <w:t xml:space="preserve">The Thinned Prime</w:t>
+        <w:t xml:space="preserve">The Laboratory Cannot Read This Patient</w:t>
       </w:r>
     </w:p>
     <w:p>
@@ -20,16 +20,16 @@
           <w:iCs/>
           <w:i/>
         </w:rPr>
-        <w:t xml:space="preserve">Every heart operation on a pump begins by diluting the patient’s own oxygen carrier on purpose, and the history of that decision is a quiet argument about how little hemoglobin a body can be trusted with</w:t>
-      </w:r>
-    </w:p>
-    <w:bookmarkStart w:id="20" w:name="the-bargain-made-at-the-circuit-door"/>
+        <w:t xml:space="preserve">A bovine oxygen carrier turns plasma the color of port wine, and every instrument built to distrust that color keeps right on distrusting it, which is a quieter hazard than any toxicity table admits</w:t>
+      </w:r>
+    </w:p>
+    <w:bookmarkStart w:id="20" w:name="the-tube-that-looks-like-an-accusation"/>
     <w:p>
       <w:pPr>
         <w:pStyle w:val="Heading2"/>
       </w:pPr>
       <w:r>
-        <w:t xml:space="preserve">The bargain made at the circuit door</w:t>
+        <w:t xml:space="preserve">The tube that looks like an accusation</w:t>
       </w:r>
     </w:p>
     <w:p>
@@ -37,33 +37,25 @@
         <w:pStyle w:val="FirstParagraph"/>
       </w:pPr>
       <w:r>
-        <w:t xml:space="preserve">Before a surgeon on a bypass pump touches the heart, someone has filled the machine with fluid. The tubing, the oxygenator, the reservoir and the pump head together hold a volume that is not trivial, and that volume has to be something. For the first years of the technique it was donor blood, a great deal of it, and the recipient of an operation on a few grams of malformed muscle might receive the blood of a dozen strangers before the chest was closed. Then a different idea took hold, almost sideways, and the machine began to be filled with clear fluid instead. The patient’s blood, on contact with the circuit, mixed into that fluid and became thinner. The hematocrit fell sharply, and the surgeons went on operating.</w:t>
-      </w:r>
-    </w:p>
-    <w:p>
-      <w:pPr>
-        <w:pStyle w:val="BodyText"/>
-      </w:pPr>
-      <w:r>
-        <w:t xml:space="preserve">That is the arrangement most cardiac patients still enter. It is rarely described to them, and for good reason: it sounds alarming, and mostly it works. Yet it carries a premise that deserves to be looked at squarely, because it is the only routine, planned, every-day case in modern medicine in which clinicians deliberately reduce the oxygen-carrying capacity of a living person and then compensate by other means. The compensation is considerable. The body is often cooled, which lowers its demand, the pump flow is set by the team, and the anesthetist watches the numbers that stand in for oxygen delivery. The bargain is that less carrier, moving faster in a quieter body, will do.</w:t>
-      </w:r>
-    </w:p>
-    <w:p>
-      <w:pPr>
-        <w:pStyle w:val="BodyText"/>
-      </w:pPr>
-      <w:r>
-        <w:t xml:space="preserve">This essay is about that bargain, not about the pump as an engineering marvel. The engineering story has been told many times. The less told story is the one inside the fluid: who first decided that the prime need not be blood, what that decision cost and saved, and why anyone who thinks about a hemoglobin-based oxygen carrier should care that surgeons have spent seventy years learning how far a patient’s own hemoglobin can be diluted before something fails.</w:t>
+        <w:t xml:space="preserve">Picture a composite scene rather than a particular hospital. A patient who has lost most of a normal blood volume has been given a Biologic Hemoglobin Oxygen Carrier, a BHOC, because red cells were refused, unavailable or incompatible. Forty minutes later a phlebotomist draws a sample, spins it, and finds that the straw-yellow plasma that every technician has seen ten thousand times has turned a deep burgundy, a shade somewhere between cranberry juice and a cheap merlot. Nothing about this is a mistake. The carrier is hemoglobin, hemoglobin is red, and the carrier now travels dissolved in the plasma instead of folded inside a cell. But the laboratory does not know that, and the laboratory has been trained, by its instruments, its quality manuals and a century of accumulated habit, to read that color as a verdict against the person who drew the blood.</w:t>
+      </w:r>
+    </w:p>
+    <w:p>
+      <w:pPr>
+        <w:pStyle w:val="BodyText"/>
+      </w:pPr>
+      <w:r>
+        <w:t xml:space="preserve">This essay is about that collision. Most writing on oxygen carriers asks whether the molecule works in the patient, whether it injures the vessel wall, whether it can be made at scale. Those questions deserve every page they receive. But a molecule that works in the body can still fail in the hospital if the hospital cannot see the patient through it, and the laboratory is the hospital’s principal pair of eyes. I think the problem is under-discussed because it is unglamorous: it lives in middleware rules, wavelength tables and the small print of analyzer inserts, none of which appear in the press releases and few of which appear in the review articles.</w:t>
       </w:r>
     </w:p>
     <w:bookmarkEnd w:id="20"/>
-    <w:bookmarkStart w:id="21" w:name="X78c50a1351ad62db861e150f75f205b8c2e83ca"/>
+    <w:bookmarkStart w:id="21" w:name="X6c3477d5e62508d40a3ed664d5d46bd3334578b"/>
     <w:p>
       <w:pPr>
         <w:pStyle w:val="Heading2"/>
       </w:pPr>
       <w:r>
-        <w:t xml:space="preserve">What the first machines asked of the blood</w:t>
+        <w:t xml:space="preserve">Why a laboratory is built to distrust free hemoglobin</w:t>
       </w:r>
     </w:p>
     <w:p>
@@ -71,41 +63,33 @@
         <w:pStyle w:val="FirstParagraph"/>
       </w:pPr>
       <w:r>
-        <w:t xml:space="preserve">The pump-oxygenator’s early history is a record of attrition. John Gibbon had spent years chasing the idea after the seventeen-hour vigil in 1931 beside a woman dying of a pulmonary embolism. His success on May 6, 1953, with an eighteen-year-old named Cecelia Bavolek, is credited as the first successful open cardiac repair with a mechanical heart-lung machine. The accounts I found disagree on how long she was on the machine, with one saying twenty-six minutes of full support and another forty-five minutes on the device, so I will not choose between them. What the accounts agree on is the sobering part: she was the only survivor among the handful of patients he attempted, reported as four to six, and Gibbon stopped operating soon afterward.</w:t>
-      </w:r>
-    </w:p>
-    <w:p>
-      <w:pPr>
-        <w:pStyle w:val="BodyText"/>
-      </w:pPr>
-      <w:r>
-        <w:t xml:space="preserve">Two other lines of work grew up in the same few years. In Minnesota, C. Walton Lillehei took a different path and used a living parent as the oxygenator. Blood passed between a child and an adult, and the adult’s lungs did the work. The first success came on March 26, 1954. One account puts the number of such operations at forty-five, with twenty-eight patients surviving, and observes grimly that the technique risked two lives for every operation. At the Mayo Clinic, John Kirklin’s group had approval from its hospital board for eight operations on the understanding that the first seven patients might all die. They began in March 1955, and about half of the cases in that first series survived.</w:t>
-      </w:r>
-    </w:p>
-    <w:p>
-      <w:pPr>
-        <w:pStyle w:val="BodyText"/>
-      </w:pPr>
-      <w:r>
-        <w:t xml:space="preserve">Richard DeWall’s disposable oxygenator, built in 1955 for under a thousand dollars according to the history I read, changed the economics. Within two years, one source says, 350 open-heart operations had been done at the University of Minnesota, and the design stayed in use into the 1970s. Cheap and simple as it was, it created a new appetite. The device had to be filled before every case, and filling it with fresh, compatible blood meant that every operation demanded a collection drive. Every operation became, in part, a blood collection exercise.</w:t>
-      </w:r>
-    </w:p>
-    <w:p>
-      <w:pPr>
-        <w:pStyle w:val="BodyText"/>
-      </w:pPr>
-      <w:r>
-        <w:t xml:space="preserve">I want to dwell on that detail because it is the pressure that made the next move thinkable. The prime was a supply problem before it was a physiological one. Anything that reduced the volume of donor blood needed would make open-heart surgery cheaper, faster and available to more places, and nobody was asking at that stage what dilution did to the patient. They were asking whether the patient would survive the night.</w:t>
+        <w:t xml:space="preserve">To understand the collision you have to understand what the red color means to a chemistry analyzer. In ordinary life, hemoglobin in plasma almost always means that red cells broke open somewhere they should not have, usually in the tube, through a needle too narrow, a draw too forceful or a delay before spinning. The laboratory treats that as contamination, because breaking a red cell releases its contents, present at far higher concentrations inside the cell than outside. A veterinary pathology teaching site I consulted lists the standard consequences: falsely raised potassium, AST, LDH and magnesium, plus spectral effects on any test that reads light near the absorbance range of hemoglobin.</w:t>
+      </w:r>
+    </w:p>
+    <w:p>
+      <w:pPr>
+        <w:pStyle w:val="BodyText"/>
+      </w:pPr>
+      <w:r>
+        <w:t xml:space="preserve">Modern analyzers measure this rather than eyeballing it. A laboratory-medicine primer on serum indices describes instruments reading the sample at several wavelengths, with hemoglobin absorbing light between roughly 340 and 440 nanometers and again between roughly 540 and 580, and computing a hemolysis index from wavelength pairs, 600 and 570 nanometers in the example of one widely used analyzer. Manufacturers publish limits for each assay, and laboratories write middleware rules, small programs between the analyzer and the hospital record, that stop results from being released automatically when the index exceeds a limit. In the ordinary case the lab then asks for a fresh draw, hunts for an unspoiled specimen from the same collection time, or releases the number with a comment.</w:t>
+      </w:r>
+    </w:p>
+    <w:p>
+      <w:pPr>
+        <w:pStyle w:val="BodyText"/>
+      </w:pPr>
+      <w:r>
+        <w:t xml:space="preserve">Now put a BHOC into this machinery. The same primer treats hemoglobin as a spectral and chemical nuisance. A carrier delivers hemoglobin on purpose, in concentrations that are not accidents of technique but a dose chosen by a prescriber. The analyzer sees a hemolysis index that would embarrass any phlebotomist, applies the rule it was told to apply, and withholds, flags or corrupts the result. A clinical laboratory page from a large academic center says the problem in one sentence that I find unusually clear: the presence of the carrier causes red-colored plasma that should not be confused with hemolysis of the red blood cells, and, strikingly, hemolysis cannot be detected in the presence of the carrier. I will return to that second clause, because I think it is the most consequential line in the entire literature on this subject.</w:t>
       </w:r>
     </w:p>
     <w:bookmarkEnd w:id="21"/>
-    <w:bookmarkStart w:id="22" w:name="sugar-water"/>
+    <w:bookmarkStart w:id="22" w:name="what-the-measurements-show"/>
     <w:p>
       <w:pPr>
         <w:pStyle w:val="Heading2"/>
       </w:pPr>
       <w:r>
-        <w:t xml:space="preserve">Sugar water</w:t>
+        <w:t xml:space="preserve">What the measurements show</w:t>
       </w:r>
     </w:p>
     <w:p>
@@ -113,49 +97,49 @@
         <w:pStyle w:val="FirstParagraph"/>
       </w:pPr>
       <w:r>
-        <w:t xml:space="preserve">The turn toward clear primes is usually credited to a handful of surgeons working around 1960, and the name that recurs for the idea is Nazih Zuhdi, who in Oklahoma described what he called total intentional hemodilution. A profile of him in a regional magazine relates the story as a question: what, he wondered, would happen if sugar water were used. In the account I read, the first human recipient was a seven-year-old boy named Terry Gene Nix, operated on in February 1960, who needed about a pint and a half of replacement blood rather than gallons. The same account says he died three years later of an unrelated illness. I could not find the operative details in a primary source, and the profile does not name the hospital, so I treat this as the origin legend rather than the verified record. But the legend has the right shape: a single bold substitution, a child, an outcome that did not collapse.</w:t>
-      </w:r>
-    </w:p>
-    <w:p>
-      <w:pPr>
-        <w:pStyle w:val="BodyText"/>
-      </w:pPr>
-      <w:r>
-        <w:t xml:space="preserve">The hard evidence appears a few years later. In 1965, a group led by Sariel Ablaza published in the</w:t>
-      </w:r>
-      <w:r>
-        <w:t xml:space="preserve"> </w:t>
-      </w:r>
-      <w:r>
-        <w:rPr>
-          <w:iCs/>
-          <w:i/>
-        </w:rPr>
-        <w:t xml:space="preserve">Archives of Surgery</w:t>
-      </w:r>
-      <w:r>
-        <w:t xml:space="preserve"> </w:t>
-      </w:r>
-      <w:r>
-        <w:t xml:space="preserve">a report on five hundred consecutive open-heart cases done with intentional hemodilution. The abstract frames the matter the way I have been describing it, saying that obtaining blood for priming the circuit had caused substantial difficulty in open-heart surgery and that hemodilution had developed out of earlier work. I could read only the opening of that paper, so I cannot report its outcomes, and I would rather say so than guess.</w:t>
-      </w:r>
-    </w:p>
-    <w:p>
-      <w:pPr>
-        <w:pStyle w:val="BodyText"/>
-      </w:pPr>
-      <w:r>
-        <w:t xml:space="preserve">What is important about this period is not any one number. It is that a cultural permission had been granted. Once surgeons had seen patients survive a hematocrit that would have prompted an urgent transfusion on a ward, the threshold moved, and it moved for the whole specialty. The prime changed from a blood product into a solution, usually balanced salts with some added colloid or sugar depending on the era and the institution, and the patient’s own red cells were the part that got watered down.</w:t>
+        <w:t xml:space="preserve">The detail matters here, because the lazy summary, that these carriers wreck lab tests, is wrong in an instructive way. The truth is patchier and therefore harder to manage.</w:t>
+      </w:r>
+    </w:p>
+    <w:p>
+      <w:pPr>
+        <w:pStyle w:val="BodyText"/>
+      </w:pPr>
+      <w:r>
+        <w:t xml:space="preserve">Consider the largest set of numbers I could verify. A study from 2018 tested the bovine carrier sold as Hemopure on four common chemistry platforms, covering 26 analytes across 104 combinations of assay, method and platform. The authors graded each result against the allowable total error for that test. In 44 of the 104 combinations, about 42 percent, the bias stayed within half the allowable error, which is the zone you can live with. In 23 combinations, about 22 percent, the carrier pushed the result significantly downward. In 26 combinations, 25 percent, it pushed the result significantly upward. In 11 combinations, about 11 percent, the analysis simply failed. Put differently, fewer than half of the tests you might order were trustworthy, and more than half either lied in one direction or the other or refused to answer. The authors attributed this to the extracellular hemoglobin mimicking severe hemolysis.</w:t>
+      </w:r>
+    </w:p>
+    <w:p>
+      <w:pPr>
+        <w:pStyle w:val="BodyText"/>
+      </w:pPr>
+      <w:r>
+        <w:t xml:space="preserve">An earlier study, published in 1997 in Clinical Chemistry, took a more varied approach and tested several hemoglobin-based carriers alongside a perfluorocarbon emulsion. At concentrations up to 50 grams per liter, the hemoglobin carriers caused essentially no interference with electrolytes, glucose and standard immunoassays, while they significantly affected protein, enzyme and cholesterol measurements on certain analyzers. In coagulation testing the effect depended on method, with some techniques unaffected and others disturbed at 20 grams per liter. The cardiac marker CK-MB read falsely low at only 5 grams per liter. Among drug levels, one aminoglycoside antibiotic read falsely high and the glycopeptide vancomycin read falsely low. The perfluorocarbon, diluted twenty-fold, interfered with none of the chemistry or immunoassay tests studied except amylase, ammonia and plasma iron. I take two lessons from that older paper. First, the problem is test-specific and method-specific, so a one-page warning sheet will be wrong in half its lines. Second, the problem is physical rather than moral: a carrier built on a different principle, oxygen dissolved in fluorocarbon droplets, goes mostly unseen by the instruments, because it is not a colored protein.</w:t>
+      </w:r>
+    </w:p>
+    <w:p>
+      <w:pPr>
+        <w:pStyle w:val="BodyText"/>
+      </w:pPr>
+      <w:r>
+        <w:t xml:space="preserve">Coagulation deserves a separate mention, because the workaround there is unusually clean. The academic laboratory page I consulted says that the prothrombin time and the activated partial thromboplastin time are disturbed when the instrument detects clotting optically, yet can be measured accurately with mechanical, magnetic or light-scattering techniques, and that platelet counts can also be measured accurately. A patient on a carrier can therefore be monitored for bleeding, but the laboratory must route those samples to a particular instrument, and somebody must know to do that before a surgeon asks why the clotting numbers are absurd.</w:t>
+      </w:r>
+    </w:p>
+    <w:p>
+      <w:pPr>
+        <w:pStyle w:val="BodyText"/>
+      </w:pPr>
+      <w:r>
+        <w:t xml:space="preserve">The pulse oximeter is the most reassuring case, and I include it for balance. A 1996 study of a bovine carrier compared finger-probe saturation with saturation from arterial blood gas analysis. Over 24 hours the mean difference in treated subjects was about 1.1 percent, with a standard error of 0.75, against 0.1 percent in controls, statistically significant but small, and the authors concluded that pulse oximetry stayed accurate across the normal range with plasma hemoglobin at 10 to 20 grams per liter. The laboratory page, by contrast, warns that the right-shifted dissociation curve may cause falsely high pulse readings and advises true saturation by co-oximetry. A shift of about one percentage point is small at the bedside and large in a research dataset, and the gap between what a clinician needs and what a trialist needs is part of the story.</w:t>
       </w:r>
     </w:p>
     <w:bookmarkEnd w:id="22"/>
-    <w:bookmarkStart w:id="23" w:name="the-smallest-bodies"/>
+    <w:bookmarkStart w:id="23" w:name="a-single-bed-closely-read"/>
     <w:p>
       <w:pPr>
         <w:pStyle w:val="Heading2"/>
       </w:pPr>
       <w:r>
-        <w:t xml:space="preserve">The smallest bodies</w:t>
+        <w:t xml:space="preserve">A single bed, closely read</w:t>
       </w:r>
     </w:p>
     <w:p>
@@ -163,33 +147,33 @@
         <w:pStyle w:val="FirstParagraph"/>
       </w:pPr>
       <w:r>
-        <w:t xml:space="preserve">Dilution is a matter of proportion, and proportion is cruelest in the small. A circuit has a fixed minimum volume, and an infant’s whole circulation may be little larger than that volume, so the clear fluid can rival or exceed the patient’s own blood. If the technique had a stress test, it would be the operating room for newborns and infants, where the same tubing that is a modest dilution for an adult becomes a flood.</w:t>
-      </w:r>
-    </w:p>
-    <w:p>
-      <w:pPr>
-        <w:pStyle w:val="BodyText"/>
-      </w:pPr>
-      <w:r>
-        <w:t xml:space="preserve">A retrospective review in the Texas Heart Institute Journal in March 1985, by Carmichael, Cooley, Kuykendall and Walker, gives a sense of what experienced hands achieved there. It covered seventy-three consecutive children under two years old with lesions of the heart and great vessels, all managed without donor blood. Nine died, a mortality of 12.3 percent, and only three of the nine deaths involved blood loss and anemia. Among the fifteen children who needed full cardiopulmonary bypass there were no deaths, and a bloodless prime was used in all seventy-three. The authors concluded that surgery could be done in these children with acceptable mortality.</w:t>
-      </w:r>
-    </w:p>
-    <w:p>
-      <w:pPr>
-        <w:pStyle w:val="BodyText"/>
-      </w:pPr>
-      <w:r>
-        <w:t xml:space="preserve">Read carefully, the paper cuts two ways. It shows that very small circulations can survive a blood-free prime in a center with unusual experience. It also records that three of nine deaths involved blood loss and anemia, so for a minority the margin was real and was crossed. The paper does not report the hemoglobin levels tolerated, so it cannot say where the cliff edge sits, and it describes the survivors of a selection process as much as a technique. The broader lesson is that the average patient has more reserve than the average protocol assumes, and that no individual can be assumed average.</w:t>
+        <w:t xml:space="preserve">Numbers across assays are abstractions. A case report gives the problem a pulse. The report, from a journal of blood research and disorders, describes a patient who was a Jehovah’s Witness with life-threatening anemia and received the bovine carrier. I want to be careful here: it is one patient, reported by the team that treated her or him, and nothing about a single case generalizes. What it does show is how the laboratory problem looks from the bedside.</w:t>
+      </w:r>
+    </w:p>
+    <w:p>
+      <w:pPr>
+        <w:pStyle w:val="BodyText"/>
+      </w:pPr>
+      <w:r>
+        <w:t xml:space="preserve">The authors write that the product is purple and causes errors in laboratory values, often being read as hemolyzed when it is not. They explain that the oxygen-carrying capacity has to be followed as total free hemoglobin, and that each unit raised free hemoglobin by about 0.63 grams per deciliter, although quantifying the response was difficult. Their pre-operative hemoglobin was 5 grams per deciliter, 5.7 by the sixth post-operative day and 9 by the sixteenth. Those figures describe a number on a report, not oxygen delivery. What they leaned on instead was the patient’s behavior: they say they saw an effect immediately and weaned vasopressors within a day of surgery. The principal laboratory complication they followed was methemoglobin, hemoglobin with its iron oxidized and unable to carry oxygen. It was 4.6 percent on the first post-operative day, peaked at 8.6 percent early on the second, and returned to normal by the seventh. They gave vitamin C, 500 milligrams every twelve hours, and kept arterial oxygen pressures supratherapeutic at 300 to 400 millimeters of mercury.</w:t>
+      </w:r>
+    </w:p>
+    <w:p>
+      <w:pPr>
+        <w:pStyle w:val="BodyText"/>
+      </w:pPr>
+      <w:r>
+        <w:t xml:space="preserve">Notice what is happening in that account. The team could not trust the ordinary hemoglobin number to mean what it normally means, so they substituted a different measurement and leaned on bedside physiology. A general principle, not something the report states, explains why. A routine hemoglobin measurement breaks open every red cell in the sample and reads all the hemoglobin that comes out, so it cannot distinguish hemoglobin that was inside cells from hemoglobin already floating free. A patient receiving a carrier therefore has a total figure that blends two very different oxygen-carrying systems, one confined to cells, the other dissolved and disappearing on a clock of its own. A 2023 study evaluated the bovine carrier on four hematology analyzers, but the journal page declined my attempts to read it, so I cannot report what it found, and I would rather leave that gap visible than fill it with a guess.</w:t>
       </w:r>
     </w:p>
     <w:bookmarkEnd w:id="23"/>
-    <w:bookmarkStart w:id="24" w:name="where-the-reserve-ends"/>
+    <w:bookmarkStart w:id="24" w:name="the-canary-that-goes-silent"/>
     <w:p>
       <w:pPr>
         <w:pStyle w:val="Heading2"/>
       </w:pPr>
       <w:r>
-        <w:t xml:space="preserve">Where the reserve ends</w:t>
+        <w:t xml:space="preserve">The canary that goes silent</w:t>
       </w:r>
     </w:p>
     <w:p>
@@ -197,49 +181,41 @@
         <w:pStyle w:val="FirstParagraph"/>
       </w:pPr>
       <w:r>
-        <w:t xml:space="preserve">If you go looking for the point at which dilution stops being tolerable, you find that the answer depends heavily on which organ you ask. The brain, the heart and the kidney have different tolerances and, in a pump, different exposures. The kidney is the instructive case, because it is an organ that works at the edge of its oxygen supply even in health. Its medulla sits in a region of low oxygen tension by design, and it has very little to spare.</w:t>
-      </w:r>
-    </w:p>
-    <w:p>
-      <w:pPr>
-        <w:pStyle w:val="BodyText"/>
-      </w:pPr>
-      <w:r>
-        <w:t xml:space="preserve">A frequently cited study by Swaminathan and colleagues and published in the</w:t>
-      </w:r>
-      <w:r>
-        <w:t xml:space="preserve"> </w:t>
-      </w:r>
-      <w:r>
-        <w:rPr>
-          <w:iCs/>
-          <w:i/>
-        </w:rPr>
-        <w:t xml:space="preserve">Annals of Thoracic Surgery</w:t>
-      </w:r>
-      <w:r>
-        <w:t xml:space="preserve"> </w:t>
-      </w:r>
-      <w:r>
-        <w:t xml:space="preserve">in 2003, followed 1,404 patients who had primary elective coronary bypass surgery. They found that the lowest hematocrit reached during bypass was associated with the change in serum creatinine afterward, and that the relationship interacted with body weight, meaning the same dilution did different things to different-sized patients. Their own conclusion was that current guidelines accepting extreme hemodilution may contribute to injury to the kidney and other organs after surgery. I take that as a cautious signal, not a proof. It is an observational study; patients who reach a low hematocrit are not randomly chosen, they tend to be smaller, or to have larger circuits relative to their blood volume, or to have been operated on by teams with particular habits. Correlation of that kind is exactly what an honest reader should handle with tongs.</w:t>
-      </w:r>
-    </w:p>
-    <w:p>
-      <w:pPr>
-        <w:pStyle w:val="BodyText"/>
-      </w:pPr>
-      <w:r>
-        <w:t xml:space="preserve">The profession’s practical answer has been to stop treating hematocrit as the number to watch. If the problem is delivery of oxygen to tissue, then the relevant quantity is the product of flow and the oxygen content of the blood, and flow can be raised when content is low. This is the logic behind what perfusionists call goal-directed perfusion, in which the pump flow is adjusted continuously to keep an indexed oxygen delivery above a chosen floor. A multicenter randomized trial of that approach was registered under the name GIFT, but when I tried to open the registry record the page returned only site boilerplate, so I cannot tell you its size, its target or its status, and I will not repeat numbers I have only half remembered. What I can say is that the existence of such trials marks a change in vocabulary: the field no longer asks how little blood a patient can have, but how much oxygen the patient is getting per minute, and by what route.</w:t>
+        <w:t xml:space="preserve">Return now to the sentence I flagged: hemolysis cannot be detected in the presence of the carrier.</w:t>
+      </w:r>
+    </w:p>
+    <w:p>
+      <w:pPr>
+        <w:pStyle w:val="BodyText"/>
+      </w:pPr>
+      <w:r>
+        <w:t xml:space="preserve">In transfusion medicine, free hemoglobin in the plasma is one of the oldest alarms in the building. When a patient receives red cells of the wrong type, the recipient’s antibodies destroy the donor cells, hemoglobin spills into plasma, and the plasma and urine change color. A technician who sees pink plasma after a transfusion reaction is trained to stop and think. That alarm exists because nature made red cells fragile in a specific way, and because plasma is supposed to be nearly colorless. A BHOC removes the second condition. If the plasma is already burgundy by design, the alarm has no sensitivity left. A real hemolytic event, whether from a mismatched red cell unit given in the same resuscitation, from a failing circulation, or from something the carrier itself did, would be hidden in the very place where it normally announces itself.</w:t>
+      </w:r>
+    </w:p>
+    <w:p>
+      <w:pPr>
+        <w:pStyle w:val="BodyText"/>
+      </w:pPr>
+      <w:r>
+        <w:t xml:space="preserve">That is my reasoning rather than a documented incident. I did not find a case in the sources I read where a missed hemolytic event was traced to this mask, and I would be inventing a story if I suggested otherwise. But the structure is clear enough to name as a design risk. The settings where a carrier makes sense, massive hemorrhage, refusal of transfusion, remote injury, are the same settings where several fluids and drugs arrive at once, and the laboratory tools that would help sort out which of them did what are the ones the carrier has degraded.</w:t>
+      </w:r>
+    </w:p>
+    <w:p>
+      <w:pPr>
+        <w:pStyle w:val="BodyText"/>
+      </w:pPr>
+      <w:r>
+        <w:t xml:space="preserve">I want to push a second consequence, because I rarely see it discussed. A red tube is also a break in blinding. If a randomized trial compares a carrier to a standard fluid, every phlebotomist, technician and nurse can see which arm a patient is in by looking at a centrifuged specimen. Allocation concealment may survive at the pharmacy door and fail at the sample rack. The concern is observer bias, sharpest for judgment-dependent outcomes such as whether to transfuse a rescue unit or repeat a test. Independent adjudicators who see only coded data, and transfusion triggers fixed in advance, are the known defenses, and the physical color of the specimen is a reason to build them on purpose.</w:t>
       </w:r>
     </w:p>
     <w:bookmarkEnd w:id="24"/>
-    <w:bookmarkStart w:id="25" w:name="the-other-way-to-save-the-blood"/>
+    <w:bookmarkStart w:id="25" w:name="workarounds-that-already-exist"/>
     <w:p>
       <w:pPr>
         <w:pStyle w:val="Heading2"/>
       </w:pPr>
       <w:r>
-        <w:t xml:space="preserve">The other way to save the blood</w:t>
+        <w:t xml:space="preserve">Workarounds that already exist</w:t>
       </w:r>
     </w:p>
     <w:p>
@@ -247,49 +223,33 @@
         <w:pStyle w:val="FirstParagraph"/>
       </w:pPr>
       <w:r>
-        <w:t xml:space="preserve">The most elegant modern trick on the pump runs in the opposite direction from dilution. Instead of accepting a thinned patient, the team tries to shrink the prime so that less thinning happens. In retrograde autologous priming, the clear fluid in the arterial and venous lines is displaced by the patient’s own blood just before the machine takes over, so that the fluid is pushed out of the circuit rather than into the patient.</w:t>
-      </w:r>
-    </w:p>
-    <w:p>
-      <w:pPr>
-        <w:pStyle w:val="BodyText"/>
-      </w:pPr>
-      <w:r>
-        <w:t xml:space="preserve">A randomized trial in the</w:t>
-      </w:r>
-      <w:r>
-        <w:t xml:space="preserve"> </w:t>
-      </w:r>
-      <w:r>
-        <w:rPr>
-          <w:iCs/>
-          <w:i/>
-        </w:rPr>
-        <w:t xml:space="preserve">European Journal of Anaesthesiology</w:t>
-      </w:r>
-      <w:r>
-        <w:t xml:space="preserve"> </w:t>
-      </w:r>
-      <w:r>
-        <w:t xml:space="preserve">in 2009 tested this in small adults, those with a body surface area under 1.5 square meters, undergoing first-time, nonemergency cardiac surgery. The 120 patients were randomized to standard priming or the retrograde technique. The mean volume of prime replaced with the patient’s own blood was about 615 milliliters. Red cell transfusion while on the pump was needed in 83.3 percent of the standard group and 26.7 percent of the retrograde group. Transfusion over the whole hospital stay was 90 percent against 50 percent, though the abstract I read did not label each figure explicitly and I am inferring that the retrograde group had the lower rate. The drop in colloid osmotic pressure ten minutes after the aortic clamp was smaller in the retrograde group. Lung, kidney and liver outcomes, and the lengths of stay in intensive care and hospital, did not differ between the groups.</w:t>
-      </w:r>
-    </w:p>
-    <w:p>
-      <w:pPr>
-        <w:pStyle w:val="BodyText"/>
-      </w:pPr>
-      <w:r>
-        <w:t xml:space="preserve">That last result is worth holding up to the light: the technique cut transfusions sharply and left the softer endpoints unchanged, which may mean dilution in this range is not harmful enough to show in a trial of that size, or that the trial was powered for transfusion and not for organ injury. Both readings fit the data.</w:t>
+        <w:t xml:space="preserve">The encouraging news is that laboratory medicine has solved harder interference problems than this, and the tools exist. They are scattered, and they are rarely collected in one place for the people who need them.</w:t>
+      </w:r>
+    </w:p>
+    <w:p>
+      <w:pPr>
+        <w:pStyle w:val="BodyText"/>
+      </w:pPr>
+      <w:r>
+        <w:t xml:space="preserve">For clotting, the mechanical, magnetic and light-scattering methods avoid the optical trap. For oxygen saturation, co-oximetry, which reads many wavelengths and measures several hemoglobin species, gives a truer answer than a two-wavelength finger probe, although a literature exists showing that hemoglobin-based substitutes can disturb co-oximetry too, so I would not treat any single instrument as final authority. The same method tracks methemoglobin, as the case report shows. For total hemoglobin, plasma hemoglobin can be measured separately, revealing how much capacity sits in each compartment. For the chemistry panel, the 2018 numbers imply a pragmatic rule: assume nothing, and validate each test on the site’s own instruments with spiked samples before anyone trusts it.</w:t>
+      </w:r>
+    </w:p>
+    <w:p>
+      <w:pPr>
+        <w:pStyle w:val="BodyText"/>
+      </w:pPr>
+      <w:r>
+        <w:t xml:space="preserve">These workarounds all presume that a laboratory knows a patient has received a carrier, and in the settings that matter most that is not guaranteed. A patient moved from a roadside to a regional trauma center to a referral hospital may pass through three laboratories, and the news that burgundy plasma is intentional lives, at best, in a handoff note. Middleware that auto-rejects hemolyzed samples can do so without a human looking, and the requesting physician may see only the word hemolyzed. The system fails quietly, which is the worst way to fail.</w:t>
       </w:r>
     </w:p>
     <w:bookmarkEnd w:id="25"/>
-    <w:bookmarkStart w:id="26" w:name="Xdc2bc4297eebaeac160aebd5dce563875686f05"/>
+    <w:bookmarkStart w:id="26" w:name="what-a-laboratory-passport-would-contain"/>
     <w:p>
       <w:pPr>
         <w:pStyle w:val="Heading2"/>
       </w:pPr>
       <w:r>
-        <w:t xml:space="preserve">What a carrier in the prime would mean, and what it would not</w:t>
+        <w:t xml:space="preserve">What a laboratory passport would contain</w:t>
       </w:r>
     </w:p>
     <w:p>
@@ -297,33 +257,49 @@
         <w:pStyle w:val="FirstParagraph"/>
       </w:pPr>
       <w:r>
-        <w:t xml:space="preserve">Here the subject meets BHOC, the Biologic Hemoglobin Oxygen Carrier, and I want to be careful not to claim more than the evidence permits. BHOC is a research area. Nothing in this essay is a statement that a cell-free carrier improves outcomes in cardiac surgery, and I know of no result that would justify one. What I can do is point at the shape of the question the pump poses, because it is unusually clean.</w:t>
-      </w:r>
-    </w:p>
-    <w:p>
-      <w:pPr>
-        <w:pStyle w:val="BodyText"/>
-      </w:pPr>
-      <w:r>
-        <w:t xml:space="preserve">In nearly every other setting where a cell-free carrier is discussed, the clinical problem is chaotic: a hemorrhage with an unknown volume lost, a stroke with an unknown territory at risk, an accident with an unknown arrival time. The pump is the reverse. The circuit is known, its volume is known, the dilution is planned in advance, the patient is monitored with more instrumentation than in almost any other room in the hospital, and the moment of lowest oxygen content is predictable to within minutes. If a cell-free carrier were ever to be tested for a role, an operation in which the hemoglobin is lowered by design is one of the few places where the moment of need can be named before it arrives.</w:t>
-      </w:r>
-    </w:p>
-    <w:p>
-      <w:pPr>
-        <w:pStyle w:val="BodyText"/>
-      </w:pPr>
-      <w:r>
-        <w:t xml:space="preserve">That cleanliness has a catch. The competing remedies are many and good: smaller circuits, retrograde priming, cell salvage, flow targets set by delivery, and a unit of red cells as a last resort. A new agent would have to beat that field of cheap, well-understood tools in a population whose baseline outcomes are already good.</w:t>
+        <w:t xml:space="preserve">These are my own suggestions, drawn from the structure of the problem and not tested anywhere I know of. The first element would be a flag in the laboratory information system, set at the time of administration, that travels with the patient record and tells the lab to treat red plasma as expected. A middleware rule that suppresses automatic rejection for flagged patients is cheap compared with a repeat draw from a patient who has little blood to spare.</w:t>
+      </w:r>
+    </w:p>
+    <w:p>
+      <w:pPr>
+        <w:pStyle w:val="BodyText"/>
+      </w:pPr>
+      <w:r>
+        <w:t xml:space="preserve">The second would be a validated test menu, built before deployment. For each analyzer a site uses, a laboratory scientist would spike donor plasma with the carrier across the concentrations expected after a dose, run the routine tests, and record whether each can be trusted, which way it errs, and which alternative method to use. The 2018 study shows why this must be done per platform: 26 analytes and four instruments made 104 situations, and fewer than half behaved.</w:t>
+      </w:r>
+    </w:p>
+    <w:p>
+      <w:pPr>
+        <w:pStyle w:val="BodyText"/>
+      </w:pPr>
+      <w:r>
+        <w:t xml:space="preserve">The third would be a physical marker: a wristband or chart sticker saying that the patient has received a bovine oxygen carrier and that plasma color is expected, with a telephone number. It is a low-technology answer to a high-technology failure, and a laboratory worker who sees the burgundy tube will instinctively look for an explanation.</w:t>
+      </w:r>
+    </w:p>
+    <w:p>
+      <w:pPr>
+        <w:pStyle w:val="BodyText"/>
+      </w:pPr>
+      <w:r>
+        <w:t xml:space="preserve">The fourth would be a written specification of which measurements a trial will use for its endpoints, chosen before enrollment, with methods that survive the carrier. If a protocol depends on a number that the product itself distorts, the trial has built a hole into its own result.</w:t>
+      </w:r>
+    </w:p>
+    <w:p>
+      <w:pPr>
+        <w:pStyle w:val="BodyText"/>
+      </w:pPr>
+      <w:r>
+        <w:t xml:space="preserve">The fifth, and the one I consider most important, is shared learning. The papers I found are scattered across clinical chemistry, anesthesia, hematology, coagulation, veterinary pathology and case reports, and one page I consulted says that these products are no longer used, a sentence that shows how easily the knowledge could be forgotten while the products remain in development. Interference data should be a standing appendix to any serious BHOC dossier, updated as instruments change.</w:t>
       </w:r>
     </w:p>
     <w:bookmarkEnd w:id="26"/>
-    <w:bookmarkStart w:id="27" w:name="the-people-who-run-the-pump"/>
+    <w:bookmarkStart w:id="27" w:name="X46083398d2f04f2f850814b91945e2f69fc710c"/>
     <w:p>
       <w:pPr>
         <w:pStyle w:val="Heading2"/>
       </w:pPr>
       <w:r>
-        <w:t xml:space="preserve">The people who run the pump</w:t>
+        <w:t xml:space="preserve">Why I trust the problem more than the product</w:t>
       </w:r>
     </w:p>
     <w:p>
@@ -331,17 +307,25 @@
         <w:pStyle w:val="FirstParagraph"/>
       </w:pPr>
       <w:r>
-        <w:t xml:space="preserve">Nearly every decision above is made by a person who rarely appears in the narrative. The perfusionist sits at the machine for the whole operation, adjusting flow, temperature, anticoagulation and fluid balance minute by minute, and the history of hemodilution is in practice a history of their habits. A cell-free pigment in the plasma could alter optical readings that were designed around red cells, including the venous saturation on which many flow decisions depend. I flag that as a general feature of the class, without a figure, because the interference would depend on the product and the device. An honest development plan would therefore begin in the perfusion lab, with bench circuits and sensor behavior, and the perfusionists would be co-investigators in the real sense.</w:t>
+        <w:t xml:space="preserve">There is a quieter lesson as well, and here the labyrinthine detail resolves into a single point. The history of this field is usually told as a history of toxicity, with vasoconstriction and heart injury receiving most of the attention. Those are real. But a molecule can also fail by being unmeasurable. It is not a death sentence: electrolytes and glucose were essentially untouched in the older study, and workarounds exist for clotting and saturation. Nor is it a footnote: more than half the assay combinations in the best dataset I could verify were biased or failed. If nobody can reliably say whether a patient is improving, nobody can reliably say whether a treatment works, and an unmeasurable benefit is, for regulatory and clinical purposes, nearly the same as none. The laboratory is not downstream of the science. It is part of it.</w:t>
+      </w:r>
+    </w:p>
+    <w:p>
+      <w:pPr>
+        <w:pStyle w:val="BodyText"/>
+      </w:pPr>
+      <w:r>
+        <w:t xml:space="preserve">I do not know how long burgundy plasma persists after a typical dose, because that depends on dose and clearance, and I found no figure I trust enough to print. I also do not know how current analyzers behave, because most of the literature concerns instruments that were current when the studies ran, some of them decades ago. Those uncertainties are themselves a finding, since a field that wishes to be taken seriously should be able to say, in a table, how its product interacts with the instruments of every hospital that might receive it.</w:t>
       </w:r>
     </w:p>
     <w:bookmarkEnd w:id="27"/>
-    <w:bookmarkStart w:id="28" w:name="what-the-history-actually-teaches"/>
+    <w:bookmarkStart w:id="28" w:name="further-reading"/>
     <w:p>
       <w:pPr>
         <w:pStyle w:val="Heading2"/>
       </w:pPr>
       <w:r>
-        <w:t xml:space="preserve">What the history actually teaches</w:t>
+        <w:t xml:space="preserve">Further reading</w:t>
       </w:r>
     </w:p>
     <w:p>
@@ -349,53 +333,11 @@
         <w:pStyle w:val="FirstParagraph"/>
       </w:pPr>
       <w:r>
-        <w:t xml:space="preserve">Seventy years of this practice leave a few durable lessons, and none of them is the triumphant one. The first is that a tolerance, once granted, spreads beyond the context that justified it. Dilution was accepted to save donor blood and to spare small hospitals a recruitment campaign, and the same acceptance was later applied to patients for whom it was a bad idea. The observational evidence that low hematocrit tracks with kidney injury is a belated attempt to renegotiate a threshold that was set for logistical convenience.</w:t>
-      </w:r>
-    </w:p>
-    <w:p>
-      <w:pPr>
-        <w:pStyle w:val="BodyText"/>
-      </w:pPr>
-      <w:r>
-        <w:t xml:space="preserve">The second is that the extreme cases teach more than the average ones. The infants in the Texas series show what the technique can do when everything is optimized and what it costs when optimization falls short.</w:t>
-      </w:r>
-    </w:p>
-    <w:p>
-      <w:pPr>
-        <w:pStyle w:val="BodyText"/>
-      </w:pPr>
-      <w:r>
-        <w:t xml:space="preserve">The third is that the number a profession watches is a decision, not a fact. For decades it was the hematocrit, because a centrifuge produced it quickly, and the move toward delivery targets concedes that it was a proxy. Anyone proposing a new carrier will be asked which number they intend to move.</w:t>
-      </w:r>
-    </w:p>
-    <w:p>
-      <w:pPr>
-        <w:pStyle w:val="BodyText"/>
-      </w:pPr>
-      <w:r>
-        <w:t xml:space="preserve">The fourth, and the one I find most useful, is that clinicians have already accepted a premise that the oxygen-carrier field often treats as radical: that a patient’s carrier can be lowered, that the loss can be survived, and that the interesting question is the margin. The field began with a surgeon asking what would happen if sugar water were used. A reasonable successor question is what would happen if, in the carefully measured minutes when the hemoglobin is at its lowest, something else were carrying part of the load, and which of the many answers already in use it would have to outperform. I do not know the answer, and I distrust anyone who says they do. But the pump is where the question can be asked with the fewest unknowns, and that is a rarer luxury than it sounds.</w:t>
+        <w:t xml:space="preserve">For the quantitative picture, look for the 2018 study of the bovine carrier Hemopure on four clinical chemistry platforms, and the 1997 Clinical Chemistry paper on hemoglobin and perfluorocarbon carriers and common laboratory tests. For saturation, the 1996 study comparing pulse oximetry with arterial blood gas saturation after a bovine carrier, and a 2001 Anesthesia and Analgesia paper on co-oximetry interference, whose full text I could not open. For coagulation, a 2001 paper on the bovine carrier and coagulation testing, which I could not retrieve and cite only by subject. For the laboratory side, the Clinical Laboratory News primer on detecting and handling hemolysis using serum indices, and the University of California San Francisco clinical laboratory page on blood substitutes. For the bedside, the case report in the International Journal of Blood Research and Disorders. Figures here are quoted as I read them in abstracts or summaries; check the originals before relying on them.</w:t>
       </w:r>
     </w:p>
     <w:bookmarkEnd w:id="28"/>
-    <w:bookmarkStart w:id="29" w:name="further-reading"/>
-    <w:p>
-      <w:pPr>
-        <w:pStyle w:val="Heading2"/>
-      </w:pPr>
-      <w:r>
-        <w:t xml:space="preserve">Further reading</w:t>
-      </w:r>
-    </w:p>
-    <w:p>
-      <w:pPr>
-        <w:pStyle w:val="FirstParagraph"/>
-      </w:pPr>
-      <w:r>
-        <w:t xml:space="preserve">For the history, the American College of Cardiology’s article on the history of cardiopulmonary bypass and the Medical Design and Development piece on the chaotic beginnings of the heart-lung machine give accessible overviews, and the Wikipedia entry on Richard DeWall collects the dates of the disposable oxygenator. For hemodilution itself, the 1965 report by Ablaza and colleagues in the Archives of Surgery and the 1985 Texas Heart Institute Journal series on cardiac surgery in small children by Carmichael, Cooley, Kuykendall and Walker are the primary sources I drew on. For the question of how low is too low, see the 2003 Annals of Thoracic Surgery paper by Swaminathan and colleagues on lowest hematocrit and kidney injury. For the retrograde priming trial, search the European Journal of Anaesthesiology for 2009 and the title phrase about small adults. Where I could read only an abstract or an opening page, I have said so above.</w:t>
-      </w:r>
-    </w:p>
     <w:bookmarkEnd w:id="29"/>
-    <w:bookmarkEnd w:id="30"/>
     <w:sectPr/>
   </w:body>
 </w:document>

</xml_diff>